<commit_message>
Remove ISBNs and journal citations from book details
Keep details to titles, authors, publishers, pages and prices, in 19 pieces.

Co-Authored-By: Claude Sonnet 5.5 <noreply@anthropic.com>
</commit_message>
<xml_diff>
--- a/content-src/docx/R TLS 1992 07 24 Glyn Maxwell Out of the Rain.docx
+++ b/content-src/docx/R TLS 1992 07 24 Glyn Maxwell Out of the Rain.docx
@@ -32,13 +32,7 @@
         <w:br/>
       </w:r>
       <w:r>
-        <w:t xml:space="preserve">Paperback, £6.95.</w:t>
-      </w:r>
-      <w:r>
-        <w:br/>
-      </w:r>
-      <w:r>
-        <w:t xml:space="preserve">1852241934&lt;/details&gt;</w:t>
+        <w:t xml:space="preserve">Paperback, £6.95.&lt;/details&gt;</w:t>
       </w:r>
     </w:p>
     <w:p>

</xml_diff>

<commit_message>
Out of the Rain: indent the 'I swam and thought' passage
Co-Authored-By: Claude Sonnet 5.5 <noreply@anthropic.com>
</commit_message>
<xml_diff>
--- a/content-src/docx/R TLS 1992 07 24 Glyn Maxwell Out of the Rain.docx
+++ b/content-src/docx/R TLS 1992 07 24 Glyn Maxwell Out of the Rain.docx
@@ -67,52 +67,63 @@
         <w:t>se / Peopled with innocents". The title-poem toys with the Noah story to picture a moment of lapsarian crisis when a world of fruitful duality, peopled by animals and their Others, including unicorns, is lost, with no one seemingly bothered but the narrator, who surveys with baffled nostalgia the complacent, forgetful survivors. The jolly romp of this long poem decelerates into banality, denial, grief:</w:t>
       </w:r>
     </w:p>
-    <w:p/>
-    <w:p>
-      <w:r>
-        <w:t>I swam and thought of the dead. I thought</w:t>
-      </w:r>
-    </w:p>
-    <w:p>
-      <w:r>
-        <w:t>"They're dead."</w:t>
-      </w:r>
-    </w:p>
-    <w:p>
-      <w:r>
-        <w:t>(I was known as a thinker at school I'll have you know.)</w:t>
-      </w:r>
-    </w:p>
-    <w:p/>
-    <w:p>
-      <w:r>
-        <w:t>I thought of the things I'd seen, and thought</w:t>
-      </w:r>
-    </w:p>
-    <w:p>
-      <w:r>
-        <w:t>"I didn't</w:t>
-      </w:r>
-    </w:p>
-    <w:p>
-      <w:r>
-        <w:t>see those things." (I was known as a liar too.)</w:t>
-      </w:r>
-    </w:p>
-    <w:p/>
-    <w:p>
-      <w:r>
-        <w:t>I swam over trees, and everything I'd once</w:t>
-      </w:r>
-    </w:p>
-    <w:p>
-      <w:r>
-        <w:t>ran through, and it all seemed much</w:t>
-      </w:r>
-    </w:p>
-    <w:p>
-      <w:r>
-        <w:t>simpler . . . .</w:t>
+    <w:p>
+      <w:r>
+        <w:t xml:space="preserve">&lt;quote&gt;</w:t>
+      </w:r>
+      <w:r>
+        <w:t xml:space="preserve">I swam and thought of the dead. I thought</w:t>
+      </w:r>
+      <w:r>
+        <w:br/>
+      </w:r>
+      <w:r>
+        <w:t xml:space="preserve">"They're dead."</w:t>
+      </w:r>
+      <w:r>
+        <w:br/>
+      </w:r>
+      <w:r>
+        <w:t xml:space="preserve">(I was known as a thinker at school I'll have you know.)</w:t>
+      </w:r>
+      <w:r>
+        <w:br/>
+      </w:r>
+      <w:r>
+        <w:t xml:space="preserve">I thought of the things I'd seen, and thought</w:t>
+      </w:r>
+      <w:r>
+        <w:br/>
+      </w:r>
+      <w:r>
+        <w:t xml:space="preserve">"I didn't</w:t>
+      </w:r>
+      <w:r>
+        <w:br/>
+      </w:r>
+      <w:r>
+        <w:t xml:space="preserve">see those things." (I was known as a liar too.)</w:t>
+      </w:r>
+      <w:r>
+        <w:br/>
+      </w:r>
+      <w:r>
+        <w:t xml:space="preserve">I swam over trees, and everything I'd once</w:t>
+      </w:r>
+      <w:r>
+        <w:br/>
+      </w:r>
+      <w:r>
+        <w:t xml:space="preserve">ran through, and it all seemed much</w:t>
+      </w:r>
+      <w:r>
+        <w:br/>
+      </w:r>
+      <w:r>
+        <w:t xml:space="preserve">simpler . . . .</w:t>
+      </w:r>
+      <w:r>
+        <w:t xml:space="preserve">&lt;/quote&gt;</w:t>
       </w:r>
     </w:p>
     <w:p/>

</xml_diff>

<commit_message>
Out of the Rain: indent the second verse, with a line space between couplets
Co-Authored-By: Claude Sonnet 5.5 <noreply@anthropic.com>
</commit_message>
<xml_diff>
--- a/content-src/docx/R TLS 1992 07 24 Glyn Maxwell Out of the Rain.docx
+++ b/content-src/docx/R TLS 1992 07 24 Glyn Maxwell Out of the Rain.docx
@@ -135,25 +135,36 @@
         <w:t xml:space="preserve"> unveiled familiar new plan", and an insidious "It" evades inspection by virtue of the hand-tying media:</w:t>
       </w:r>
     </w:p>
-    <w:p/>
     <w:p>
       <w:r>
-        <w:t>Don't forget</w:t>
-      </w:r>
-    </w:p>
-    <w:p>
-      <w:r>
-        <w:t>Nothing will start that hasn't started yet</w:t>
-      </w:r>
-    </w:p>
-    <w:p>
-      <w:r>
-        <w:t>Don't forget</w:t>
-      </w:r>
-    </w:p>
-    <w:p>
-      <w:r>
-        <w:t>It, its friend, its foe and its opposite.</w:t>
+        <w:t xml:space="preserve">&lt;quote&gt;</w:t>
+      </w:r>
+      <w:r>
+        <w:t xml:space="preserve">Don't forget</w:t>
+      </w:r>
+      <w:r>
+        <w:br/>
+      </w:r>
+      <w:r>
+        <w:t xml:space="preserve">Nothing will start that hasn't started yet</w:t>
+      </w:r>
+      <w:r>
+        <w:br/>
+      </w:r>
+      <w:r>
+        <w:br/>
+      </w:r>
+      <w:r>
+        <w:t xml:space="preserve">Don't forget</w:t>
+      </w:r>
+      <w:r>
+        <w:br/>
+      </w:r>
+      <w:r>
+        <w:t xml:space="preserve">It, its friend, its foe and its opposite.</w:t>
+      </w:r>
+      <w:r>
+        <w:t xml:space="preserve">&lt;/quote&gt;</w:t>
       </w:r>
     </w:p>
     <w:p/>

</xml_diff>